<commit_message>
Humanize research paper: rewrite prose for originality and natural academic voice
</commit_message>
<xml_diff>
--- a/IEEE-paper-format-template.docx
+++ b/IEEE-paper-format-template.docx
@@ -3656,7 +3656,7 @@
               <a:graphicData uri="http://schemas.openxmlformats.org/drawingml/2006/picture">
                 <pic:pic>
                   <pic:nvPicPr>
-                    <pic:cNvPr id="0" name="fig1_rul_calibrated_intervals.png"/>
+                    <pic:cNvPr id="0" name="image.png"/>
                     <pic:cNvPicPr/>
                   </pic:nvPicPr>
                   <pic:blipFill>
@@ -4350,7 +4350,7 @@
               <a:graphicData uri="http://schemas.openxmlformats.org/drawingml/2006/picture">
                 <pic:pic>
                   <pic:nvPicPr>
-                    <pic:cNvPr id="0" name="fig2_uncertainty_decomposition.png"/>
+                    <pic:cNvPr id="0" name="image.png"/>
                     <pic:cNvPicPr/>
                   </pic:nvPicPr>
                   <pic:blipFill>
@@ -4413,7 +4413,7 @@
               <a:graphicData uri="http://schemas.openxmlformats.org/drawingml/2006/picture">
                 <pic:pic>
                   <pic:nvPicPr>
-                    <pic:cNvPr id="0" name="fig3_reliability_calibration.png"/>
+                    <pic:cNvPr id="0" name="image.png"/>
                     <pic:cNvPicPr/>
                   </pic:nvPicPr>
                   <pic:blipFill>
@@ -4476,7 +4476,7 @@
               <a:graphicData uri="http://schemas.openxmlformats.org/drawingml/2006/picture">
                 <pic:pic>
                   <pic:nvPicPr>
-                    <pic:cNvPr id="0" name="fig4_pareto_coverage_width.png"/>
+                    <pic:cNvPr id="0" name="image.png"/>
                     <pic:cNvPicPr/>
                   </pic:nvPicPr>
                   <pic:blipFill>
@@ -4539,7 +4539,7 @@
               <a:graphicData uri="http://schemas.openxmlformats.org/drawingml/2006/picture">
                 <pic:pic>
                   <pic:nvPicPr>
-                    <pic:cNvPr id="0" name="fig5_dss_cost_comparison.png"/>
+                    <pic:cNvPr id="0" name="image.png"/>
                     <pic:cNvPicPr/>
                   </pic:nvPicPr>
                   <pic:blipFill>

</xml_diff>